<commit_message>
Aim, Scope & Applicability
</commit_message>
<xml_diff>
--- a/Proposal STUDY-BUDDY.docx
+++ b/Proposal STUDY-BUDDY.docx
@@ -2494,7 +2494,6 @@
         </w:rPr>
         <w:t xml:space="preserve">The primary goal is to develop a functional, user-friendly software application that meets the </w:t>
       </w:r>
-      <w:bookmarkStart w:id="7" w:name="_GoBack"/>
       <w:r>
         <w:rPr>
           <w:rFonts w:cs="Times New Roman"/>
@@ -2578,9 +2577,565 @@
         <w:t>To make learning resources easily searchable and well-organized</w:t>
       </w:r>
     </w:p>
+    <w:p>
+      <w:pPr>
+        <w:spacing w:after="0" w:line="360" w:lineRule="auto"/>
+        <w:jc w:val="both"/>
+        <w:rPr>
+          <w:rFonts w:asciiTheme="majorHAnsi" w:hAnsiTheme="majorHAnsi" w:cstheme="majorHAnsi"/>
+        </w:rPr>
+      </w:pPr>
+    </w:p>
+    <w:p>
+      <w:pPr>
+        <w:pStyle w:val="Heading2"/>
+        <w:spacing w:line="360" w:lineRule="auto"/>
+        <w:rPr>
+          <w:rFonts w:eastAsia="Times New Roman" w:cs="Times New Roman"/>
+        </w:rPr>
+      </w:pPr>
+      <w:bookmarkStart w:id="7" w:name="_Toc233811472"/>
+    </w:p>
+    <w:p>
+      <w:pPr>
+        <w:pStyle w:val="Heading2"/>
+        <w:spacing w:line="360" w:lineRule="auto"/>
+        <w:rPr>
+          <w:rFonts w:eastAsia="Times New Roman" w:cs="Times New Roman"/>
+        </w:rPr>
+      </w:pPr>
+    </w:p>
+    <w:p>
+      <w:pPr>
+        <w:pStyle w:val="Heading2"/>
+        <w:spacing w:line="360" w:lineRule="auto"/>
+        <w:rPr>
+          <w:rFonts w:eastAsia="Times New Roman" w:cs="Times New Roman"/>
+        </w:rPr>
+      </w:pPr>
+    </w:p>
+    <w:p>
+      <w:pPr>
+        <w:pStyle w:val="Heading2"/>
+        <w:spacing w:line="360" w:lineRule="auto"/>
+        <w:rPr>
+          <w:rFonts w:eastAsia="Times New Roman" w:cs="Times New Roman"/>
+        </w:rPr>
+      </w:pPr>
+    </w:p>
+    <w:p>
+      <w:pPr>
+        <w:pStyle w:val="Heading2"/>
+        <w:spacing w:line="360" w:lineRule="auto"/>
+        <w:rPr>
+          <w:rFonts w:eastAsia="Times New Roman" w:cs="Times New Roman"/>
+        </w:rPr>
+      </w:pPr>
+    </w:p>
+    <w:p>
+      <w:pPr>
+        <w:pStyle w:val="Heading2"/>
+        <w:spacing w:line="360" w:lineRule="auto"/>
+        <w:rPr>
+          <w:rFonts w:eastAsia="Times New Roman" w:cs="Times New Roman"/>
+        </w:rPr>
+      </w:pPr>
+    </w:p>
+    <w:p>
+      <w:pPr>
+        <w:pStyle w:val="Heading2"/>
+        <w:spacing w:line="360" w:lineRule="auto"/>
+        <w:rPr>
+          <w:rFonts w:eastAsia="Times New Roman" w:cs="Times New Roman"/>
+        </w:rPr>
+      </w:pPr>
+    </w:p>
+    <w:p>
+      <w:pPr>
+        <w:pStyle w:val="Heading2"/>
+        <w:spacing w:line="360" w:lineRule="auto"/>
+        <w:rPr>
+          <w:rFonts w:eastAsia="Times New Roman" w:cs="Times New Roman"/>
+        </w:rPr>
+      </w:pPr>
+    </w:p>
+    <w:p>
+      <w:pPr>
+        <w:pStyle w:val="Heading2"/>
+        <w:spacing w:line="360" w:lineRule="auto"/>
+        <w:rPr>
+          <w:rFonts w:eastAsia="Times New Roman" w:cs="Times New Roman"/>
+        </w:rPr>
+      </w:pPr>
+    </w:p>
+    <w:p>
+      <w:pPr>
+        <w:pStyle w:val="Heading2"/>
+        <w:spacing w:line="360" w:lineRule="auto"/>
+        <w:rPr>
+          <w:rFonts w:eastAsia="Times New Roman" w:cs="Times New Roman"/>
+        </w:rPr>
+      </w:pPr>
+    </w:p>
+    <w:p>
+      <w:pPr>
+        <w:pStyle w:val="Heading2"/>
+        <w:spacing w:line="360" w:lineRule="auto"/>
+        <w:rPr>
+          <w:rFonts w:eastAsia="Times New Roman" w:cs="Times New Roman"/>
+        </w:rPr>
+      </w:pPr>
+    </w:p>
+    <w:p>
+      <w:pPr>
+        <w:pStyle w:val="Heading2"/>
+        <w:spacing w:line="360" w:lineRule="auto"/>
+        <w:rPr>
+          <w:rFonts w:eastAsia="Times New Roman" w:cs="Times New Roman"/>
+        </w:rPr>
+      </w:pPr>
+    </w:p>
+    <w:p>
+      <w:pPr>
+        <w:pStyle w:val="Heading2"/>
+        <w:spacing w:line="360" w:lineRule="auto"/>
+        <w:rPr>
+          <w:rFonts w:eastAsia="Times New Roman" w:cs="Times New Roman"/>
+        </w:rPr>
+      </w:pPr>
+    </w:p>
+    <w:p>
+      <w:pPr>
+        <w:pStyle w:val="Heading2"/>
+        <w:spacing w:line="360" w:lineRule="auto"/>
+        <w:rPr>
+          <w:rFonts w:eastAsia="Times New Roman" w:cs="Times New Roman"/>
+        </w:rPr>
+      </w:pPr>
+    </w:p>
+    <w:p>
+      <w:pPr>
+        <w:pStyle w:val="Heading2"/>
+        <w:spacing w:line="360" w:lineRule="auto"/>
+        <w:rPr>
+          <w:rFonts w:eastAsia="Times New Roman" w:cs="Times New Roman"/>
+        </w:rPr>
+      </w:pPr>
+    </w:p>
+    <w:p>
+      <w:pPr>
+        <w:pStyle w:val="Heading2"/>
+        <w:spacing w:line="360" w:lineRule="auto"/>
+        <w:rPr>
+          <w:rFonts w:eastAsia="Times New Roman" w:cs="Times New Roman"/>
+        </w:rPr>
+      </w:pPr>
+    </w:p>
+    <w:p>
+      <w:pPr>
+        <w:pStyle w:val="Heading2"/>
+        <w:spacing w:line="360" w:lineRule="auto"/>
+        <w:rPr>
+          <w:rFonts w:eastAsia="Times New Roman" w:cs="Times New Roman"/>
+        </w:rPr>
+      </w:pPr>
+    </w:p>
+    <w:p>
+      <w:pPr>
+        <w:pStyle w:val="Heading2"/>
+        <w:spacing w:line="360" w:lineRule="auto"/>
+        <w:rPr>
+          <w:rFonts w:eastAsia="Times New Roman" w:cs="Times New Roman"/>
+        </w:rPr>
+      </w:pPr>
+    </w:p>
+    <w:p>
+      <w:pPr>
+        <w:pStyle w:val="Heading2"/>
+        <w:spacing w:line="360" w:lineRule="auto"/>
+        <w:rPr>
+          <w:rFonts w:eastAsia="Times New Roman" w:cs="Times New Roman"/>
+        </w:rPr>
+      </w:pPr>
+    </w:p>
+    <w:p>
+      <w:pPr>
+        <w:pStyle w:val="Heading2"/>
+        <w:spacing w:line="360" w:lineRule="auto"/>
+        <w:rPr>
+          <w:rFonts w:eastAsia="Times New Roman" w:cs="Times New Roman"/>
+        </w:rPr>
+      </w:pPr>
+    </w:p>
+    <w:p>
+      <w:pPr>
+        <w:pStyle w:val="Heading2"/>
+        <w:spacing w:line="360" w:lineRule="auto"/>
+        <w:rPr>
+          <w:rFonts w:eastAsia="Times New Roman" w:cs="Times New Roman"/>
+        </w:rPr>
+      </w:pPr>
+    </w:p>
+    <w:p>
+      <w:pPr>
+        <w:pStyle w:val="Heading2"/>
+        <w:spacing w:line="360" w:lineRule="auto"/>
+        <w:rPr>
+          <w:rFonts w:eastAsia="Times New Roman" w:cs="Times New Roman"/>
+        </w:rPr>
+      </w:pPr>
+    </w:p>
+    <w:p>
+      <w:pPr>
+        <w:pStyle w:val="Heading2"/>
+        <w:spacing w:line="360" w:lineRule="auto"/>
+        <w:rPr>
+          <w:rFonts w:eastAsia="Times New Roman" w:cs="Times New Roman"/>
+        </w:rPr>
+      </w:pPr>
+    </w:p>
+    <w:p>
+      <w:pPr>
+        <w:pStyle w:val="Heading2"/>
+        <w:spacing w:line="360" w:lineRule="auto"/>
+        <w:rPr>
+          <w:rFonts w:eastAsia="Times New Roman" w:cs="Times New Roman"/>
+        </w:rPr>
+      </w:pPr>
+    </w:p>
     <w:bookmarkEnd w:id="7"/>
     <w:p>
       <w:pPr>
+        <w:pStyle w:val="Heading2"/>
+        <w:spacing w:line="360" w:lineRule="auto"/>
+        <w:rPr>
+          <w:rFonts w:eastAsia="Times New Roman" w:cs="Times New Roman"/>
+        </w:rPr>
+      </w:pPr>
+    </w:p>
+    <w:p>
+      <w:pPr>
+        <w:rPr>
+          <w:b/>
+          <w:sz w:val="32"/>
+          <w:szCs w:val="32"/>
+        </w:rPr>
+      </w:pPr>
+      <w:r>
+        <w:rPr>
+          <w:b/>
+          <w:sz w:val="32"/>
+          <w:szCs w:val="32"/>
+        </w:rPr>
+        <w:lastRenderedPageBreak/>
+        <w:t>4. Aim, Scope &amp; Applicability</w:t>
+      </w:r>
+    </w:p>
+    <w:p>
+      <w:pPr>
+        <w:pStyle w:val="Heading3"/>
+        <w:spacing w:line="360" w:lineRule="auto"/>
+        <w:rPr>
+          <w:rFonts w:ascii="Times New Roman" w:hAnsi="Times New Roman" w:cs="Times New Roman"/>
+          <w:b/>
+          <w:color w:val="000000" w:themeColor="text1"/>
+          <w:sz w:val="28"/>
+          <w:szCs w:val="28"/>
+        </w:rPr>
+      </w:pPr>
+      <w:bookmarkStart w:id="8" w:name="_Toc233811473"/>
+      <w:r>
+        <w:rPr>
+          <w:rFonts w:ascii="Times New Roman" w:hAnsi="Times New Roman" w:cs="Times New Roman"/>
+          <w:b/>
+          <w:color w:val="000000" w:themeColor="text1"/>
+          <w:sz w:val="28"/>
+          <w:szCs w:val="28"/>
+        </w:rPr>
+        <w:t>4</w:t>
+      </w:r>
+      <w:r>
+        <w:rPr>
+          <w:rFonts w:ascii="Times New Roman" w:hAnsi="Times New Roman" w:cs="Times New Roman"/>
+          <w:b/>
+          <w:color w:val="000000" w:themeColor="text1"/>
+          <w:sz w:val="28"/>
+          <w:szCs w:val="28"/>
+        </w:rPr>
+        <w:t>.1.  Aim</w:t>
+      </w:r>
+      <w:bookmarkEnd w:id="8"/>
+    </w:p>
+    <w:p>
+      <w:pPr>
+        <w:numPr>
+          <w:ilvl w:val="0"/>
+          <w:numId w:val="15"/>
+        </w:numPr>
+        <w:spacing w:before="240" w:line="360" w:lineRule="auto"/>
+        <w:jc w:val="both"/>
+        <w:rPr>
+          <w:rFonts w:cs="Times New Roman"/>
+          <w:szCs w:val="24"/>
+        </w:rPr>
+      </w:pPr>
+      <w:r>
+        <w:rPr>
+          <w:rFonts w:cs="Times New Roman"/>
+          <w:szCs w:val="24"/>
+        </w:rPr>
+        <w:t>Action-oriented academic hub</w:t>
+      </w:r>
+    </w:p>
+    <w:p>
+      <w:pPr>
+        <w:numPr>
+          <w:ilvl w:val="0"/>
+          <w:numId w:val="15"/>
+        </w:numPr>
+        <w:spacing w:line="360" w:lineRule="auto"/>
+        <w:jc w:val="both"/>
+        <w:rPr>
+          <w:rFonts w:cs="Times New Roman"/>
+          <w:szCs w:val="24"/>
+        </w:rPr>
+      </w:pPr>
+      <w:r>
+        <w:rPr>
+          <w:rFonts w:cs="Times New Roman"/>
+          <w:szCs w:val="24"/>
+        </w:rPr>
+        <w:t>Study-material management</w:t>
+      </w:r>
+    </w:p>
+    <w:p>
+      <w:pPr>
+        <w:numPr>
+          <w:ilvl w:val="0"/>
+          <w:numId w:val="15"/>
+        </w:numPr>
+        <w:spacing w:line="360" w:lineRule="auto"/>
+        <w:jc w:val="both"/>
+        <w:rPr>
+          <w:rFonts w:cs="Times New Roman"/>
+          <w:sz w:val="22"/>
+        </w:rPr>
+      </w:pPr>
+      <w:r>
+        <w:rPr>
+          <w:rFonts w:cs="Times New Roman"/>
+          <w:szCs w:val="24"/>
+        </w:rPr>
+        <w:t>Make academic Organized</w:t>
+      </w:r>
+    </w:p>
+    <w:p>
+      <w:pPr>
+        <w:pStyle w:val="Heading3"/>
+        <w:spacing w:line="360" w:lineRule="auto"/>
+        <w:rPr>
+          <w:rFonts w:ascii="Times New Roman" w:hAnsi="Times New Roman" w:cs="Times New Roman"/>
+          <w:b/>
+          <w:color w:val="000000" w:themeColor="text1"/>
+          <w:sz w:val="28"/>
+          <w:szCs w:val="28"/>
+        </w:rPr>
+      </w:pPr>
+      <w:r>
+        <w:rPr>
+          <w:rFonts w:ascii="Times New Roman" w:eastAsia="Times New Roman" w:hAnsi="Times New Roman" w:cs="Times New Roman"/>
+          <w:b/>
+          <w:color w:val="000000" w:themeColor="text1"/>
+          <w:sz w:val="28"/>
+          <w:szCs w:val="28"/>
+        </w:rPr>
+        <w:t>4</w:t>
+      </w:r>
+      <w:r>
+        <w:rPr>
+          <w:rFonts w:ascii="Times New Roman" w:eastAsia="Times New Roman" w:hAnsi="Times New Roman" w:cs="Times New Roman"/>
+          <w:b/>
+          <w:color w:val="000000" w:themeColor="text1"/>
+          <w:sz w:val="28"/>
+          <w:szCs w:val="28"/>
+        </w:rPr>
+        <w:t>.2.  Scope</w:t>
+      </w:r>
+    </w:p>
+    <w:p>
+      <w:pPr>
+        <w:numPr>
+          <w:ilvl w:val="0"/>
+          <w:numId w:val="16"/>
+        </w:numPr>
+        <w:spacing w:before="240" w:line="360" w:lineRule="auto"/>
+        <w:jc w:val="both"/>
+        <w:rPr>
+          <w:rFonts w:cs="Times New Roman"/>
+          <w:szCs w:val="24"/>
+        </w:rPr>
+      </w:pPr>
+      <w:r>
+        <w:rPr>
+          <w:rFonts w:cs="Times New Roman"/>
+          <w:szCs w:val="24"/>
+        </w:rPr>
+        <w:t>User management system</w:t>
+      </w:r>
+    </w:p>
+    <w:p>
+      <w:pPr>
+        <w:numPr>
+          <w:ilvl w:val="0"/>
+          <w:numId w:val="16"/>
+        </w:numPr>
+        <w:spacing w:line="360" w:lineRule="auto"/>
+        <w:jc w:val="both"/>
+        <w:rPr>
+          <w:rFonts w:cs="Times New Roman"/>
+          <w:szCs w:val="24"/>
+        </w:rPr>
+      </w:pPr>
+      <w:r>
+        <w:rPr>
+          <w:rFonts w:cs="Times New Roman"/>
+          <w:szCs w:val="24"/>
+        </w:rPr>
+        <w:t>Study resource sharing</w:t>
+      </w:r>
+      <w:bookmarkStart w:id="9" w:name="_GoBack"/>
+      <w:bookmarkEnd w:id="9"/>
+    </w:p>
+    <w:p>
+      <w:pPr>
+        <w:numPr>
+          <w:ilvl w:val="0"/>
+          <w:numId w:val="16"/>
+        </w:numPr>
+        <w:spacing w:line="360" w:lineRule="auto"/>
+        <w:jc w:val="both"/>
+        <w:rPr>
+          <w:rFonts w:cs="Times New Roman"/>
+          <w:szCs w:val="24"/>
+        </w:rPr>
+      </w:pPr>
+      <w:r>
+        <w:rPr>
+          <w:rFonts w:cs="Times New Roman"/>
+          <w:szCs w:val="24"/>
+        </w:rPr>
+        <w:t>Request and upload feature</w:t>
+      </w:r>
+    </w:p>
+    <w:p>
+      <w:pPr>
+        <w:numPr>
+          <w:ilvl w:val="0"/>
+          <w:numId w:val="16"/>
+        </w:numPr>
+        <w:spacing w:line="360" w:lineRule="auto"/>
+        <w:jc w:val="both"/>
+        <w:rPr>
+          <w:rFonts w:cs="Times New Roman"/>
+          <w:szCs w:val="24"/>
+        </w:rPr>
+      </w:pPr>
+      <w:r>
+        <w:rPr>
+          <w:rFonts w:cs="Times New Roman"/>
+          <w:szCs w:val="24"/>
+        </w:rPr>
+        <w:t>Search and organize materials</w:t>
+      </w:r>
+    </w:p>
+    <w:p>
+      <w:pPr>
+        <w:pStyle w:val="Heading3"/>
+        <w:numPr>
+          <w:ilvl w:val="1"/>
+          <w:numId w:val="19"/>
+        </w:numPr>
+        <w:spacing w:line="360" w:lineRule="auto"/>
+        <w:rPr>
+          <w:rFonts w:ascii="Times New Roman" w:eastAsia="Times New Roman" w:hAnsi="Times New Roman" w:cs="Times New Roman"/>
+          <w:b/>
+          <w:color w:val="000000" w:themeColor="text1"/>
+          <w:sz w:val="28"/>
+          <w:szCs w:val="28"/>
+        </w:rPr>
+      </w:pPr>
+      <w:r>
+        <w:rPr>
+          <w:rFonts w:ascii="Times New Roman" w:eastAsia="Times New Roman" w:hAnsi="Times New Roman" w:cs="Times New Roman"/>
+          <w:b/>
+          <w:color w:val="000000" w:themeColor="text1"/>
+          <w:sz w:val="28"/>
+          <w:szCs w:val="28"/>
+        </w:rPr>
+        <w:t>Applicability</w:t>
+      </w:r>
+    </w:p>
+    <w:p>
+      <w:pPr>
+        <w:spacing w:before="240" w:line="360" w:lineRule="auto"/>
+        <w:jc w:val="both"/>
+        <w:rPr>
+          <w:rFonts w:cs="Times New Roman"/>
+          <w:szCs w:val="24"/>
+        </w:rPr>
+      </w:pPr>
+      <w:r>
+        <w:rPr>
+          <w:rFonts w:cs="Times New Roman"/>
+          <w:szCs w:val="24"/>
+        </w:rPr>
+        <w:t>Study-Buddy is applicable to:</w:t>
+      </w:r>
+    </w:p>
+    <w:p>
+      <w:pPr>
+        <w:numPr>
+          <w:ilvl w:val="0"/>
+          <w:numId w:val="17"/>
+        </w:numPr>
+        <w:spacing w:line="360" w:lineRule="auto"/>
+        <w:jc w:val="both"/>
+        <w:rPr>
+          <w:rFonts w:cs="Times New Roman"/>
+          <w:szCs w:val="24"/>
+        </w:rPr>
+      </w:pPr>
+      <w:r>
+        <w:rPr>
+          <w:rFonts w:cs="Times New Roman"/>
+          <w:szCs w:val="24"/>
+        </w:rPr>
+        <w:t>School students</w:t>
+      </w:r>
+    </w:p>
+    <w:p>
+      <w:pPr>
+        <w:numPr>
+          <w:ilvl w:val="0"/>
+          <w:numId w:val="17"/>
+        </w:numPr>
+        <w:spacing w:line="360" w:lineRule="auto"/>
+        <w:jc w:val="both"/>
+        <w:rPr>
+          <w:rFonts w:cs="Times New Roman"/>
+          <w:szCs w:val="24"/>
+        </w:rPr>
+      </w:pPr>
+      <w:r>
+        <w:rPr>
+          <w:rFonts w:cs="Times New Roman"/>
+          <w:szCs w:val="24"/>
+        </w:rPr>
+        <w:t>College and university students</w:t>
+      </w:r>
+    </w:p>
+    <w:p>
+      <w:pPr>
         <w:spacing w:after="0" w:line="360" w:lineRule="auto"/>
         <w:jc w:val="both"/>
         <w:rPr>
@@ -2653,20 +3208,17 @@
     </w:p>
     <w:p>
       <w:pPr>
-        <w:spacing w:after="0" w:line="360" w:lineRule="auto"/>
-        <w:jc w:val="both"/>
-        <w:rPr>
-          <w:rFonts w:asciiTheme="majorHAnsi" w:hAnsiTheme="majorHAnsi" w:cstheme="majorHAnsi"/>
-        </w:rPr>
-      </w:pPr>
-    </w:p>
-    <w:p>
-      <w:pPr>
-        <w:spacing w:line="360" w:lineRule="auto"/>
-        <w:jc w:val="both"/>
-      </w:pPr>
-      <w:bookmarkStart w:id="8" w:name="_Toc196205397"/>
-      <w:bookmarkStart w:id="9" w:name="_Toc196923484"/>
+        <w:spacing w:line="360" w:lineRule="auto"/>
+        <w:jc w:val="both"/>
+      </w:pPr>
+      <w:bookmarkStart w:id="10" w:name="_Toc196205397"/>
+      <w:bookmarkStart w:id="11" w:name="_Toc196923484"/>
+    </w:p>
+    <w:p>
+      <w:pPr>
+        <w:spacing w:line="360" w:lineRule="auto"/>
+        <w:jc w:val="both"/>
+      </w:pPr>
     </w:p>
     <w:p>
       <w:pPr>
@@ -2715,7 +3267,7 @@
           <w:color w:val="auto"/>
         </w:rPr>
       </w:pPr>
-      <w:bookmarkStart w:id="10" w:name="_Toc229078644"/>
+      <w:bookmarkStart w:id="12" w:name="_Toc229078644"/>
       <w:r>
         <w:rPr>
           <w:rFonts w:cs="Times New Roman"/>
@@ -2740,7 +3292,7 @@
         </w:rPr>
         <w:t>Background Study:</w:t>
       </w:r>
-      <w:bookmarkEnd w:id="10"/>
+      <w:bookmarkEnd w:id="12"/>
     </w:p>
     <w:p>
       <w:pPr>
@@ -2777,7 +3329,6 @@
           <w:sz w:val="32"/>
           <w:szCs w:val="32"/>
         </w:rPr>
-        <w:lastRenderedPageBreak/>
         <w:t>Existing Systems</w:t>
       </w:r>
     </w:p>
@@ -3299,6 +3850,7 @@
           <w:rFonts w:eastAsia="Times New Roman" w:cs="Times New Roman"/>
           <w:szCs w:val="24"/>
         </w:rPr>
+        <w:lastRenderedPageBreak/>
         <w:t xml:space="preserve">Most platforms are either commercial (locked behind paywalls) </w:t>
       </w:r>
     </w:p>
@@ -3371,7 +3923,7 @@
           <w:color w:val="auto"/>
         </w:rPr>
       </w:pPr>
-      <w:bookmarkStart w:id="11" w:name="_Toc229078645"/>
+      <w:bookmarkStart w:id="13" w:name="_Toc229078645"/>
       <w:r>
         <w:rPr>
           <w:rFonts w:cs="Times New Roman"/>
@@ -3380,9 +3932,9 @@
         </w:rPr>
         <w:t>Methodology:</w:t>
       </w:r>
-      <w:bookmarkEnd w:id="8"/>
-      <w:bookmarkEnd w:id="9"/>
+      <w:bookmarkEnd w:id="10"/>
       <w:bookmarkEnd w:id="11"/>
+      <w:bookmarkEnd w:id="13"/>
     </w:p>
     <w:p>
       <w:pPr>
@@ -3430,7 +3982,6 @@
           <w:rFonts w:asciiTheme="majorHAnsi" w:hAnsiTheme="majorHAnsi" w:cstheme="majorHAnsi"/>
           <w:noProof/>
         </w:rPr>
-        <w:lastRenderedPageBreak/>
         <w:drawing>
           <wp:anchor distT="0" distB="0" distL="114300" distR="114300" simplePos="0" relativeHeight="251663360" behindDoc="1" locked="0" layoutInCell="1" allowOverlap="1" wp14:anchorId="53BDD66B" wp14:editId="0FA3B6DB">
             <wp:simplePos x="0" y="0"/>
@@ -3743,8 +4294,8 @@
           <w:szCs w:val="32"/>
         </w:rPr>
       </w:pPr>
-      <w:bookmarkStart w:id="12" w:name="_Toc196205398"/>
-      <w:bookmarkStart w:id="13" w:name="_Toc196923485"/>
+      <w:bookmarkStart w:id="14" w:name="_Toc196205398"/>
+      <w:bookmarkStart w:id="15" w:name="_Toc196923485"/>
     </w:p>
     <w:p>
       <w:pPr>
@@ -3758,7 +4309,7 @@
           <w:color w:val="auto"/>
         </w:rPr>
       </w:pPr>
-      <w:bookmarkStart w:id="14" w:name="_Toc229078646"/>
+      <w:bookmarkStart w:id="16" w:name="_Toc229078646"/>
       <w:r>
         <w:rPr>
           <w:rFonts w:cstheme="majorHAnsi"/>
@@ -3825,8 +4376,8 @@
         </w:rPr>
         <w:t>G</w:t>
       </w:r>
-      <w:bookmarkEnd w:id="12"/>
-      <w:bookmarkEnd w:id="13"/>
+      <w:bookmarkEnd w:id="14"/>
+      <w:bookmarkEnd w:id="15"/>
       <w:r>
         <w:rPr>
           <w:rFonts w:cs="Times New Roman"/>
@@ -3843,7 +4394,7 @@
         </w:rPr>
         <w:t>:</w:t>
       </w:r>
-      <w:bookmarkEnd w:id="14"/>
+      <w:bookmarkEnd w:id="16"/>
     </w:p>
     <w:p>
       <w:pPr>
@@ -4102,7 +4653,7 @@
       <w:pPr>
         <w:spacing w:line="360" w:lineRule="auto"/>
       </w:pPr>
-      <w:bookmarkStart w:id="15" w:name="_Toc196923486"/>
+      <w:bookmarkStart w:id="17" w:name="_Toc196923486"/>
     </w:p>
     <w:p>
       <w:pPr>
@@ -4135,7 +4686,7 @@
           <w:color w:val="auto"/>
         </w:rPr>
       </w:pPr>
-      <w:bookmarkStart w:id="16" w:name="_Toc229078647"/>
+      <w:bookmarkStart w:id="18" w:name="_Toc229078647"/>
       <w:r>
         <w:rPr>
           <w:rFonts w:cs="Times New Roman"/>
@@ -4153,7 +4704,7 @@
         </w:rPr>
         <w:t>Requirement Document:</w:t>
       </w:r>
-      <w:bookmarkEnd w:id="16"/>
+      <w:bookmarkEnd w:id="18"/>
     </w:p>
     <w:p>
       <w:pPr>
@@ -4168,8 +4719,8 @@
           <w:szCs w:val="28"/>
         </w:rPr>
       </w:pPr>
-      <w:bookmarkStart w:id="17" w:name="_Toc204546100"/>
-      <w:bookmarkStart w:id="18" w:name="_Toc229078648"/>
+      <w:bookmarkStart w:id="19" w:name="_Toc204546100"/>
+      <w:bookmarkStart w:id="20" w:name="_Toc229078648"/>
       <w:r>
         <w:rPr>
           <w:rFonts w:cs="Times New Roman"/>
@@ -4180,8 +4731,8 @@
         </w:rPr>
         <w:t>6.1 Functional Requirements</w:t>
       </w:r>
-      <w:bookmarkEnd w:id="17"/>
-      <w:bookmarkEnd w:id="18"/>
+      <w:bookmarkEnd w:id="19"/>
+      <w:bookmarkEnd w:id="20"/>
     </w:p>
     <w:p>
       <w:pPr>
@@ -4867,7 +5418,7 @@
         </w:rPr>
         <w:t xml:space="preserve"> </w:t>
       </w:r>
-      <w:bookmarkStart w:id="19" w:name="_Toc229078649"/>
+      <w:bookmarkStart w:id="21" w:name="_Toc229078649"/>
       <w:r>
         <w:rPr>
           <w:rFonts w:eastAsia="Times New Roman" w:cs="Times New Roman"/>
@@ -4898,7 +5449,7 @@
         </w:rPr>
         <w:t>Non-Functional Requirements</w:t>
       </w:r>
-      <w:bookmarkEnd w:id="19"/>
+      <w:bookmarkEnd w:id="21"/>
     </w:p>
     <w:p>
       <w:pPr>
@@ -5302,7 +5853,7 @@
         </w:rPr>
       </w:pPr>
     </w:p>
-    <w:bookmarkEnd w:id="15"/>
+    <w:bookmarkEnd w:id="17"/>
     <w:p>
       <w:pPr>
         <w:rPr>
@@ -5319,12 +5870,12 @@
         <w:spacing w:before="0" w:after="240" w:line="360" w:lineRule="auto"/>
         <w:jc w:val="both"/>
       </w:pPr>
-      <w:bookmarkStart w:id="20" w:name="_Toc229078650"/>
+      <w:bookmarkStart w:id="22" w:name="_Toc229078650"/>
       <w:r>
         <w:lastRenderedPageBreak/>
         <w:t>7. System design</w:t>
       </w:r>
-      <w:bookmarkEnd w:id="20"/>
+      <w:bookmarkEnd w:id="22"/>
     </w:p>
     <w:p>
       <w:pPr>
@@ -6063,7 +6614,7 @@
         <w:spacing w:before="0" w:after="240" w:line="360" w:lineRule="auto"/>
         <w:jc w:val="both"/>
       </w:pPr>
-      <w:bookmarkStart w:id="21" w:name="_Toc229078651"/>
+      <w:bookmarkStart w:id="23" w:name="_Toc229078651"/>
       <w:r>
         <w:lastRenderedPageBreak/>
         <w:t>7</w:t>
@@ -6077,7 +6628,7 @@
       <w:r>
         <w:t>Deliverables:</w:t>
       </w:r>
-      <w:bookmarkEnd w:id="21"/>
+      <w:bookmarkEnd w:id="23"/>
     </w:p>
     <w:p>
       <w:pPr>
@@ -6337,7 +6888,7 @@
             <w:noProof/>
             <w:szCs w:val="24"/>
           </w:rPr>
-          <w:t>14</w:t>
+          <w:t>8</w:t>
         </w:r>
         <w:r>
           <w:rPr>
@@ -6772,6 +7323,268 @@
     </w:lvl>
   </w:abstractNum>
   <w:abstractNum w:abstractNumId="3" w15:restartNumberingAfterBreak="0">
+    <w:nsid w:val="1A9862D8"/>
+    <w:multiLevelType w:val="multilevel"/>
+    <w:tmpl w:val="829AF650"/>
+    <w:lvl w:ilvl="0">
+      <w:start w:val="1"/>
+      <w:numFmt w:val="bullet"/>
+      <w:lvlText w:val=""/>
+      <w:lvlJc w:val="left"/>
+      <w:pPr>
+        <w:tabs>
+          <w:tab w:val="num" w:pos="720"/>
+        </w:tabs>
+        <w:ind w:left="720" w:hanging="360"/>
+      </w:pPr>
+      <w:rPr>
+        <w:rFonts w:ascii="Symbol" w:hAnsi="Symbol" w:hint="default"/>
+        <w:sz w:val="20"/>
+      </w:rPr>
+    </w:lvl>
+    <w:lvl w:ilvl="1" w:tentative="1">
+      <w:start w:val="1"/>
+      <w:numFmt w:val="bullet"/>
+      <w:lvlText w:val=""/>
+      <w:lvlJc w:val="left"/>
+      <w:pPr>
+        <w:tabs>
+          <w:tab w:val="num" w:pos="1440"/>
+        </w:tabs>
+        <w:ind w:left="1440" w:hanging="360"/>
+      </w:pPr>
+      <w:rPr>
+        <w:rFonts w:ascii="Symbol" w:hAnsi="Symbol" w:hint="default"/>
+        <w:sz w:val="20"/>
+      </w:rPr>
+    </w:lvl>
+    <w:lvl w:ilvl="2" w:tentative="1">
+      <w:start w:val="1"/>
+      <w:numFmt w:val="bullet"/>
+      <w:lvlText w:val=""/>
+      <w:lvlJc w:val="left"/>
+      <w:pPr>
+        <w:tabs>
+          <w:tab w:val="num" w:pos="2160"/>
+        </w:tabs>
+        <w:ind w:left="2160" w:hanging="360"/>
+      </w:pPr>
+      <w:rPr>
+        <w:rFonts w:ascii="Symbol" w:hAnsi="Symbol" w:hint="default"/>
+        <w:sz w:val="20"/>
+      </w:rPr>
+    </w:lvl>
+    <w:lvl w:ilvl="3" w:tentative="1">
+      <w:start w:val="1"/>
+      <w:numFmt w:val="bullet"/>
+      <w:lvlText w:val=""/>
+      <w:lvlJc w:val="left"/>
+      <w:pPr>
+        <w:tabs>
+          <w:tab w:val="num" w:pos="2880"/>
+        </w:tabs>
+        <w:ind w:left="2880" w:hanging="360"/>
+      </w:pPr>
+      <w:rPr>
+        <w:rFonts w:ascii="Symbol" w:hAnsi="Symbol" w:hint="default"/>
+        <w:sz w:val="20"/>
+      </w:rPr>
+    </w:lvl>
+    <w:lvl w:ilvl="4" w:tentative="1">
+      <w:start w:val="1"/>
+      <w:numFmt w:val="bullet"/>
+      <w:lvlText w:val=""/>
+      <w:lvlJc w:val="left"/>
+      <w:pPr>
+        <w:tabs>
+          <w:tab w:val="num" w:pos="3600"/>
+        </w:tabs>
+        <w:ind w:left="3600" w:hanging="360"/>
+      </w:pPr>
+      <w:rPr>
+        <w:rFonts w:ascii="Symbol" w:hAnsi="Symbol" w:hint="default"/>
+        <w:sz w:val="20"/>
+      </w:rPr>
+    </w:lvl>
+    <w:lvl w:ilvl="5" w:tentative="1">
+      <w:start w:val="1"/>
+      <w:numFmt w:val="bullet"/>
+      <w:lvlText w:val=""/>
+      <w:lvlJc w:val="left"/>
+      <w:pPr>
+        <w:tabs>
+          <w:tab w:val="num" w:pos="4320"/>
+        </w:tabs>
+        <w:ind w:left="4320" w:hanging="360"/>
+      </w:pPr>
+      <w:rPr>
+        <w:rFonts w:ascii="Symbol" w:hAnsi="Symbol" w:hint="default"/>
+        <w:sz w:val="20"/>
+      </w:rPr>
+    </w:lvl>
+    <w:lvl w:ilvl="6" w:tentative="1">
+      <w:start w:val="1"/>
+      <w:numFmt w:val="bullet"/>
+      <w:lvlText w:val=""/>
+      <w:lvlJc w:val="left"/>
+      <w:pPr>
+        <w:tabs>
+          <w:tab w:val="num" w:pos="5040"/>
+        </w:tabs>
+        <w:ind w:left="5040" w:hanging="360"/>
+      </w:pPr>
+      <w:rPr>
+        <w:rFonts w:ascii="Symbol" w:hAnsi="Symbol" w:hint="default"/>
+        <w:sz w:val="20"/>
+      </w:rPr>
+    </w:lvl>
+    <w:lvl w:ilvl="7" w:tentative="1">
+      <w:start w:val="1"/>
+      <w:numFmt w:val="bullet"/>
+      <w:lvlText w:val=""/>
+      <w:lvlJc w:val="left"/>
+      <w:pPr>
+        <w:tabs>
+          <w:tab w:val="num" w:pos="5760"/>
+        </w:tabs>
+        <w:ind w:left="5760" w:hanging="360"/>
+      </w:pPr>
+      <w:rPr>
+        <w:rFonts w:ascii="Symbol" w:hAnsi="Symbol" w:hint="default"/>
+        <w:sz w:val="20"/>
+      </w:rPr>
+    </w:lvl>
+    <w:lvl w:ilvl="8" w:tentative="1">
+      <w:start w:val="1"/>
+      <w:numFmt w:val="bullet"/>
+      <w:lvlText w:val=""/>
+      <w:lvlJc w:val="left"/>
+      <w:pPr>
+        <w:tabs>
+          <w:tab w:val="num" w:pos="6480"/>
+        </w:tabs>
+        <w:ind w:left="6480" w:hanging="360"/>
+      </w:pPr>
+      <w:rPr>
+        <w:rFonts w:ascii="Symbol" w:hAnsi="Symbol" w:hint="default"/>
+        <w:sz w:val="20"/>
+      </w:rPr>
+    </w:lvl>
+  </w:abstractNum>
+  <w:abstractNum w:abstractNumId="4" w15:restartNumberingAfterBreak="0">
+    <w:nsid w:val="1AD33F4B"/>
+    <w:multiLevelType w:val="multilevel"/>
+    <w:tmpl w:val="BC50CFF0"/>
+    <w:lvl w:ilvl="0">
+      <w:start w:val="4"/>
+      <w:numFmt w:val="decimal"/>
+      <w:lvlText w:val="%1"/>
+      <w:lvlJc w:val="left"/>
+      <w:pPr>
+        <w:ind w:left="360" w:hanging="360"/>
+      </w:pPr>
+      <w:rPr>
+        <w:rFonts w:hint="default"/>
+      </w:rPr>
+    </w:lvl>
+    <w:lvl w:ilvl="1">
+      <w:start w:val="3"/>
+      <w:numFmt w:val="decimal"/>
+      <w:lvlText w:val="%1.%2"/>
+      <w:lvlJc w:val="left"/>
+      <w:pPr>
+        <w:ind w:left="720" w:hanging="360"/>
+      </w:pPr>
+      <w:rPr>
+        <w:rFonts w:hint="default"/>
+      </w:rPr>
+    </w:lvl>
+    <w:lvl w:ilvl="2">
+      <w:start w:val="1"/>
+      <w:numFmt w:val="decimal"/>
+      <w:lvlText w:val="%1.%2.%3"/>
+      <w:lvlJc w:val="left"/>
+      <w:pPr>
+        <w:ind w:left="1440" w:hanging="720"/>
+      </w:pPr>
+      <w:rPr>
+        <w:rFonts w:hint="default"/>
+      </w:rPr>
+    </w:lvl>
+    <w:lvl w:ilvl="3">
+      <w:start w:val="1"/>
+      <w:numFmt w:val="decimal"/>
+      <w:lvlText w:val="%1.%2.%3.%4"/>
+      <w:lvlJc w:val="left"/>
+      <w:pPr>
+        <w:ind w:left="1800" w:hanging="720"/>
+      </w:pPr>
+      <w:rPr>
+        <w:rFonts w:hint="default"/>
+      </w:rPr>
+    </w:lvl>
+    <w:lvl w:ilvl="4">
+      <w:start w:val="1"/>
+      <w:numFmt w:val="decimal"/>
+      <w:lvlText w:val="%1.%2.%3.%4.%5"/>
+      <w:lvlJc w:val="left"/>
+      <w:pPr>
+        <w:ind w:left="2520" w:hanging="1080"/>
+      </w:pPr>
+      <w:rPr>
+        <w:rFonts w:hint="default"/>
+      </w:rPr>
+    </w:lvl>
+    <w:lvl w:ilvl="5">
+      <w:start w:val="1"/>
+      <w:numFmt w:val="decimal"/>
+      <w:lvlText w:val="%1.%2.%3.%4.%5.%6"/>
+      <w:lvlJc w:val="left"/>
+      <w:pPr>
+        <w:ind w:left="2880" w:hanging="1080"/>
+      </w:pPr>
+      <w:rPr>
+        <w:rFonts w:hint="default"/>
+      </w:rPr>
+    </w:lvl>
+    <w:lvl w:ilvl="6">
+      <w:start w:val="1"/>
+      <w:numFmt w:val="decimal"/>
+      <w:lvlText w:val="%1.%2.%3.%4.%5.%6.%7"/>
+      <w:lvlJc w:val="left"/>
+      <w:pPr>
+        <w:ind w:left="3600" w:hanging="1440"/>
+      </w:pPr>
+      <w:rPr>
+        <w:rFonts w:hint="default"/>
+      </w:rPr>
+    </w:lvl>
+    <w:lvl w:ilvl="7">
+      <w:start w:val="1"/>
+      <w:numFmt w:val="decimal"/>
+      <w:lvlText w:val="%1.%2.%3.%4.%5.%6.%7.%8"/>
+      <w:lvlJc w:val="left"/>
+      <w:pPr>
+        <w:ind w:left="3960" w:hanging="1440"/>
+      </w:pPr>
+      <w:rPr>
+        <w:rFonts w:hint="default"/>
+      </w:rPr>
+    </w:lvl>
+    <w:lvl w:ilvl="8">
+      <w:start w:val="1"/>
+      <w:numFmt w:val="decimal"/>
+      <w:lvlText w:val="%1.%2.%3.%4.%5.%6.%7.%8.%9"/>
+      <w:lvlJc w:val="left"/>
+      <w:pPr>
+        <w:ind w:left="4680" w:hanging="1800"/>
+      </w:pPr>
+      <w:rPr>
+        <w:rFonts w:hint="default"/>
+      </w:rPr>
+    </w:lvl>
+  </w:abstractNum>
+  <w:abstractNum w:abstractNumId="5" w15:restartNumberingAfterBreak="0">
     <w:nsid w:val="28586ADB"/>
     <w:multiLevelType w:val="hybridMultilevel"/>
     <w:tmpl w:val="666E1694"/>
@@ -6884,7 +7697,7 @@
       </w:rPr>
     </w:lvl>
   </w:abstractNum>
-  <w:abstractNum w:abstractNumId="4" w15:restartNumberingAfterBreak="0">
+  <w:abstractNum w:abstractNumId="6" w15:restartNumberingAfterBreak="0">
     <w:nsid w:val="2CF56EA8"/>
     <w:multiLevelType w:val="hybridMultilevel"/>
     <w:tmpl w:val="DDA22FD0"/>
@@ -6974,7 +7787,7 @@
       </w:pPr>
     </w:lvl>
   </w:abstractNum>
-  <w:abstractNum w:abstractNumId="5" w15:restartNumberingAfterBreak="0">
+  <w:abstractNum w:abstractNumId="7" w15:restartNumberingAfterBreak="0">
     <w:nsid w:val="2F1743F2"/>
     <w:multiLevelType w:val="multilevel"/>
     <w:tmpl w:val="E140F350"/>
@@ -7123,7 +7936,128 @@
       </w:rPr>
     </w:lvl>
   </w:abstractNum>
-  <w:abstractNum w:abstractNumId="6" w15:restartNumberingAfterBreak="0">
+  <w:abstractNum w:abstractNumId="8" w15:restartNumberingAfterBreak="0">
+    <w:nsid w:val="30CE7E04"/>
+    <w:multiLevelType w:val="multilevel"/>
+    <w:tmpl w:val="543294D2"/>
+    <w:lvl w:ilvl="0">
+      <w:start w:val="1"/>
+      <w:numFmt w:val="decimal"/>
+      <w:lvlText w:val="%1."/>
+      <w:lvlJc w:val="left"/>
+      <w:pPr>
+        <w:ind w:left="720" w:hanging="360"/>
+      </w:pPr>
+      <w:rPr>
+        <w:rFonts w:hint="default"/>
+      </w:rPr>
+    </w:lvl>
+    <w:lvl w:ilvl="1">
+      <w:start w:val="3"/>
+      <w:numFmt w:val="decimal"/>
+      <w:isLgl/>
+      <w:lvlText w:val="%1.%2."/>
+      <w:lvlJc w:val="left"/>
+      <w:pPr>
+        <w:ind w:left="900" w:hanging="540"/>
+      </w:pPr>
+      <w:rPr>
+        <w:rFonts w:hint="default"/>
+      </w:rPr>
+    </w:lvl>
+    <w:lvl w:ilvl="2">
+      <w:start w:val="3"/>
+      <w:numFmt w:val="decimal"/>
+      <w:isLgl/>
+      <w:lvlText w:val="%1.%2.%3."/>
+      <w:lvlJc w:val="left"/>
+      <w:pPr>
+        <w:ind w:left="1080" w:hanging="720"/>
+      </w:pPr>
+      <w:rPr>
+        <w:rFonts w:hint="default"/>
+      </w:rPr>
+    </w:lvl>
+    <w:lvl w:ilvl="3">
+      <w:start w:val="1"/>
+      <w:numFmt w:val="decimal"/>
+      <w:isLgl/>
+      <w:lvlText w:val="%1.%2.%3.%4."/>
+      <w:lvlJc w:val="left"/>
+      <w:pPr>
+        <w:ind w:left="1080" w:hanging="720"/>
+      </w:pPr>
+      <w:rPr>
+        <w:rFonts w:hint="default"/>
+      </w:rPr>
+    </w:lvl>
+    <w:lvl w:ilvl="4">
+      <w:start w:val="1"/>
+      <w:numFmt w:val="decimal"/>
+      <w:isLgl/>
+      <w:lvlText w:val="%1.%2.%3.%4.%5."/>
+      <w:lvlJc w:val="left"/>
+      <w:pPr>
+        <w:ind w:left="1440" w:hanging="1080"/>
+      </w:pPr>
+      <w:rPr>
+        <w:rFonts w:hint="default"/>
+      </w:rPr>
+    </w:lvl>
+    <w:lvl w:ilvl="5">
+      <w:start w:val="1"/>
+      <w:numFmt w:val="decimal"/>
+      <w:isLgl/>
+      <w:lvlText w:val="%1.%2.%3.%4.%5.%6."/>
+      <w:lvlJc w:val="left"/>
+      <w:pPr>
+        <w:ind w:left="1440" w:hanging="1080"/>
+      </w:pPr>
+      <w:rPr>
+        <w:rFonts w:hint="default"/>
+      </w:rPr>
+    </w:lvl>
+    <w:lvl w:ilvl="6">
+      <w:start w:val="1"/>
+      <w:numFmt w:val="decimal"/>
+      <w:isLgl/>
+      <w:lvlText w:val="%1.%2.%3.%4.%5.%6.%7."/>
+      <w:lvlJc w:val="left"/>
+      <w:pPr>
+        <w:ind w:left="1800" w:hanging="1440"/>
+      </w:pPr>
+      <w:rPr>
+        <w:rFonts w:hint="default"/>
+      </w:rPr>
+    </w:lvl>
+    <w:lvl w:ilvl="7">
+      <w:start w:val="1"/>
+      <w:numFmt w:val="decimal"/>
+      <w:isLgl/>
+      <w:lvlText w:val="%1.%2.%3.%4.%5.%6.%7.%8."/>
+      <w:lvlJc w:val="left"/>
+      <w:pPr>
+        <w:ind w:left="1800" w:hanging="1440"/>
+      </w:pPr>
+      <w:rPr>
+        <w:rFonts w:hint="default"/>
+      </w:rPr>
+    </w:lvl>
+    <w:lvl w:ilvl="8">
+      <w:start w:val="1"/>
+      <w:numFmt w:val="decimal"/>
+      <w:isLgl/>
+      <w:lvlText w:val="%1.%2.%3.%4.%5.%6.%7.%8.%9."/>
+      <w:lvlJc w:val="left"/>
+      <w:pPr>
+        <w:ind w:left="2160" w:hanging="1800"/>
+      </w:pPr>
+      <w:rPr>
+        <w:rFonts w:hint="default"/>
+      </w:rPr>
+    </w:lvl>
+  </w:abstractNum>
+  <w:abstractNum w:abstractNumId="9" w15:restartNumberingAfterBreak="0">
     <w:nsid w:val="40B93481"/>
     <w:multiLevelType w:val="hybridMultilevel"/>
     <w:tmpl w:val="8938A8B6"/>
@@ -7236,7 +8170,7 @@
       </w:rPr>
     </w:lvl>
   </w:abstractNum>
-  <w:abstractNum w:abstractNumId="7" w15:restartNumberingAfterBreak="0">
+  <w:abstractNum w:abstractNumId="10" w15:restartNumberingAfterBreak="0">
     <w:nsid w:val="52B52959"/>
     <w:multiLevelType w:val="multilevel"/>
     <w:tmpl w:val="0D167EFA"/>
@@ -7385,7 +8319,147 @@
       </w:rPr>
     </w:lvl>
   </w:abstractNum>
-  <w:abstractNum w:abstractNumId="8" w15:restartNumberingAfterBreak="0">
+  <w:abstractNum w:abstractNumId="11" w15:restartNumberingAfterBreak="0">
+    <w:nsid w:val="6073607D"/>
+    <w:multiLevelType w:val="hybridMultilevel"/>
+    <w:tmpl w:val="E31AF948"/>
+    <w:lvl w:ilvl="0" w:tplc="04090001">
+      <w:start w:val="1"/>
+      <w:numFmt w:val="bullet"/>
+      <w:lvlText w:val=""/>
+      <w:lvlJc w:val="left"/>
+      <w:pPr>
+        <w:tabs>
+          <w:tab w:val="num" w:pos="720"/>
+        </w:tabs>
+        <w:ind w:left="720" w:hanging="360"/>
+      </w:pPr>
+      <w:rPr>
+        <w:rFonts w:ascii="Symbol" w:hAnsi="Symbol" w:hint="default"/>
+      </w:rPr>
+    </w:lvl>
+    <w:lvl w:ilvl="1" w:tplc="2EA6F454" w:tentative="1">
+      <w:start w:val="1"/>
+      <w:numFmt w:val="bullet"/>
+      <w:lvlText w:val=""/>
+      <w:lvlJc w:val="left"/>
+      <w:pPr>
+        <w:tabs>
+          <w:tab w:val="num" w:pos="1440"/>
+        </w:tabs>
+        <w:ind w:left="1440" w:hanging="360"/>
+      </w:pPr>
+      <w:rPr>
+        <w:rFonts w:ascii="Wingdings" w:hAnsi="Wingdings" w:hint="default"/>
+      </w:rPr>
+    </w:lvl>
+    <w:lvl w:ilvl="2" w:tplc="F8383DC6" w:tentative="1">
+      <w:start w:val="1"/>
+      <w:numFmt w:val="bullet"/>
+      <w:lvlText w:val=""/>
+      <w:lvlJc w:val="left"/>
+      <w:pPr>
+        <w:tabs>
+          <w:tab w:val="num" w:pos="2160"/>
+        </w:tabs>
+        <w:ind w:left="2160" w:hanging="360"/>
+      </w:pPr>
+      <w:rPr>
+        <w:rFonts w:ascii="Wingdings" w:hAnsi="Wingdings" w:hint="default"/>
+      </w:rPr>
+    </w:lvl>
+    <w:lvl w:ilvl="3" w:tplc="3B384CDA" w:tentative="1">
+      <w:start w:val="1"/>
+      <w:numFmt w:val="bullet"/>
+      <w:lvlText w:val=""/>
+      <w:lvlJc w:val="left"/>
+      <w:pPr>
+        <w:tabs>
+          <w:tab w:val="num" w:pos="2880"/>
+        </w:tabs>
+        <w:ind w:left="2880" w:hanging="360"/>
+      </w:pPr>
+      <w:rPr>
+        <w:rFonts w:ascii="Wingdings" w:hAnsi="Wingdings" w:hint="default"/>
+      </w:rPr>
+    </w:lvl>
+    <w:lvl w:ilvl="4" w:tplc="9C8C21CA" w:tentative="1">
+      <w:start w:val="1"/>
+      <w:numFmt w:val="bullet"/>
+      <w:lvlText w:val=""/>
+      <w:lvlJc w:val="left"/>
+      <w:pPr>
+        <w:tabs>
+          <w:tab w:val="num" w:pos="3600"/>
+        </w:tabs>
+        <w:ind w:left="3600" w:hanging="360"/>
+      </w:pPr>
+      <w:rPr>
+        <w:rFonts w:ascii="Wingdings" w:hAnsi="Wingdings" w:hint="default"/>
+      </w:rPr>
+    </w:lvl>
+    <w:lvl w:ilvl="5" w:tplc="CB948A6A" w:tentative="1">
+      <w:start w:val="1"/>
+      <w:numFmt w:val="bullet"/>
+      <w:lvlText w:val=""/>
+      <w:lvlJc w:val="left"/>
+      <w:pPr>
+        <w:tabs>
+          <w:tab w:val="num" w:pos="4320"/>
+        </w:tabs>
+        <w:ind w:left="4320" w:hanging="360"/>
+      </w:pPr>
+      <w:rPr>
+        <w:rFonts w:ascii="Wingdings" w:hAnsi="Wingdings" w:hint="default"/>
+      </w:rPr>
+    </w:lvl>
+    <w:lvl w:ilvl="6" w:tplc="A1F6F5CC" w:tentative="1">
+      <w:start w:val="1"/>
+      <w:numFmt w:val="bullet"/>
+      <w:lvlText w:val=""/>
+      <w:lvlJc w:val="left"/>
+      <w:pPr>
+        <w:tabs>
+          <w:tab w:val="num" w:pos="5040"/>
+        </w:tabs>
+        <w:ind w:left="5040" w:hanging="360"/>
+      </w:pPr>
+      <w:rPr>
+        <w:rFonts w:ascii="Wingdings" w:hAnsi="Wingdings" w:hint="default"/>
+      </w:rPr>
+    </w:lvl>
+    <w:lvl w:ilvl="7" w:tplc="472005F6" w:tentative="1">
+      <w:start w:val="1"/>
+      <w:numFmt w:val="bullet"/>
+      <w:lvlText w:val=""/>
+      <w:lvlJc w:val="left"/>
+      <w:pPr>
+        <w:tabs>
+          <w:tab w:val="num" w:pos="5760"/>
+        </w:tabs>
+        <w:ind w:left="5760" w:hanging="360"/>
+      </w:pPr>
+      <w:rPr>
+        <w:rFonts w:ascii="Wingdings" w:hAnsi="Wingdings" w:hint="default"/>
+      </w:rPr>
+    </w:lvl>
+    <w:lvl w:ilvl="8" w:tplc="1ADE12E8" w:tentative="1">
+      <w:start w:val="1"/>
+      <w:numFmt w:val="bullet"/>
+      <w:lvlText w:val=""/>
+      <w:lvlJc w:val="left"/>
+      <w:pPr>
+        <w:tabs>
+          <w:tab w:val="num" w:pos="6480"/>
+        </w:tabs>
+        <w:ind w:left="6480" w:hanging="360"/>
+      </w:pPr>
+      <w:rPr>
+        <w:rFonts w:ascii="Wingdings" w:hAnsi="Wingdings" w:hint="default"/>
+      </w:rPr>
+    </w:lvl>
+  </w:abstractNum>
+  <w:abstractNum w:abstractNumId="12" w15:restartNumberingAfterBreak="0">
     <w:nsid w:val="66B21804"/>
     <w:multiLevelType w:val="hybridMultilevel"/>
     <w:tmpl w:val="F92EE1F0"/>
@@ -7498,7 +8572,147 @@
       </w:rPr>
     </w:lvl>
   </w:abstractNum>
-  <w:abstractNum w:abstractNumId="9" w15:restartNumberingAfterBreak="0">
+  <w:abstractNum w:abstractNumId="13" w15:restartNumberingAfterBreak="0">
+    <w:nsid w:val="680E236A"/>
+    <w:multiLevelType w:val="hybridMultilevel"/>
+    <w:tmpl w:val="886AF5A8"/>
+    <w:lvl w:ilvl="0" w:tplc="EBBABD9A">
+      <w:start w:val="1"/>
+      <w:numFmt w:val="bullet"/>
+      <w:lvlText w:val="•"/>
+      <w:lvlJc w:val="left"/>
+      <w:pPr>
+        <w:tabs>
+          <w:tab w:val="num" w:pos="720"/>
+        </w:tabs>
+        <w:ind w:left="720" w:hanging="360"/>
+      </w:pPr>
+      <w:rPr>
+        <w:rFonts w:ascii="Arial" w:hAnsi="Arial" w:hint="default"/>
+      </w:rPr>
+    </w:lvl>
+    <w:lvl w:ilvl="1" w:tplc="64021C50" w:tentative="1">
+      <w:start w:val="1"/>
+      <w:numFmt w:val="bullet"/>
+      <w:lvlText w:val="•"/>
+      <w:lvlJc w:val="left"/>
+      <w:pPr>
+        <w:tabs>
+          <w:tab w:val="num" w:pos="1440"/>
+        </w:tabs>
+        <w:ind w:left="1440" w:hanging="360"/>
+      </w:pPr>
+      <w:rPr>
+        <w:rFonts w:ascii="Arial" w:hAnsi="Arial" w:hint="default"/>
+      </w:rPr>
+    </w:lvl>
+    <w:lvl w:ilvl="2" w:tplc="7C94C23C" w:tentative="1">
+      <w:start w:val="1"/>
+      <w:numFmt w:val="bullet"/>
+      <w:lvlText w:val="•"/>
+      <w:lvlJc w:val="left"/>
+      <w:pPr>
+        <w:tabs>
+          <w:tab w:val="num" w:pos="2160"/>
+        </w:tabs>
+        <w:ind w:left="2160" w:hanging="360"/>
+      </w:pPr>
+      <w:rPr>
+        <w:rFonts w:ascii="Arial" w:hAnsi="Arial" w:hint="default"/>
+      </w:rPr>
+    </w:lvl>
+    <w:lvl w:ilvl="3" w:tplc="2B860F9E" w:tentative="1">
+      <w:start w:val="1"/>
+      <w:numFmt w:val="bullet"/>
+      <w:lvlText w:val="•"/>
+      <w:lvlJc w:val="left"/>
+      <w:pPr>
+        <w:tabs>
+          <w:tab w:val="num" w:pos="2880"/>
+        </w:tabs>
+        <w:ind w:left="2880" w:hanging="360"/>
+      </w:pPr>
+      <w:rPr>
+        <w:rFonts w:ascii="Arial" w:hAnsi="Arial" w:hint="default"/>
+      </w:rPr>
+    </w:lvl>
+    <w:lvl w:ilvl="4" w:tplc="9092AEF4" w:tentative="1">
+      <w:start w:val="1"/>
+      <w:numFmt w:val="bullet"/>
+      <w:lvlText w:val="•"/>
+      <w:lvlJc w:val="left"/>
+      <w:pPr>
+        <w:tabs>
+          <w:tab w:val="num" w:pos="3600"/>
+        </w:tabs>
+        <w:ind w:left="3600" w:hanging="360"/>
+      </w:pPr>
+      <w:rPr>
+        <w:rFonts w:ascii="Arial" w:hAnsi="Arial" w:hint="default"/>
+      </w:rPr>
+    </w:lvl>
+    <w:lvl w:ilvl="5" w:tplc="69FEC5FC" w:tentative="1">
+      <w:start w:val="1"/>
+      <w:numFmt w:val="bullet"/>
+      <w:lvlText w:val="•"/>
+      <w:lvlJc w:val="left"/>
+      <w:pPr>
+        <w:tabs>
+          <w:tab w:val="num" w:pos="4320"/>
+        </w:tabs>
+        <w:ind w:left="4320" w:hanging="360"/>
+      </w:pPr>
+      <w:rPr>
+        <w:rFonts w:ascii="Arial" w:hAnsi="Arial" w:hint="default"/>
+      </w:rPr>
+    </w:lvl>
+    <w:lvl w:ilvl="6" w:tplc="115C5B9C" w:tentative="1">
+      <w:start w:val="1"/>
+      <w:numFmt w:val="bullet"/>
+      <w:lvlText w:val="•"/>
+      <w:lvlJc w:val="left"/>
+      <w:pPr>
+        <w:tabs>
+          <w:tab w:val="num" w:pos="5040"/>
+        </w:tabs>
+        <w:ind w:left="5040" w:hanging="360"/>
+      </w:pPr>
+      <w:rPr>
+        <w:rFonts w:ascii="Arial" w:hAnsi="Arial" w:hint="default"/>
+      </w:rPr>
+    </w:lvl>
+    <w:lvl w:ilvl="7" w:tplc="C98C8B0E" w:tentative="1">
+      <w:start w:val="1"/>
+      <w:numFmt w:val="bullet"/>
+      <w:lvlText w:val="•"/>
+      <w:lvlJc w:val="left"/>
+      <w:pPr>
+        <w:tabs>
+          <w:tab w:val="num" w:pos="5760"/>
+        </w:tabs>
+        <w:ind w:left="5760" w:hanging="360"/>
+      </w:pPr>
+      <w:rPr>
+        <w:rFonts w:ascii="Arial" w:hAnsi="Arial" w:hint="default"/>
+      </w:rPr>
+    </w:lvl>
+    <w:lvl w:ilvl="8" w:tplc="36FCB1AE" w:tentative="1">
+      <w:start w:val="1"/>
+      <w:numFmt w:val="bullet"/>
+      <w:lvlText w:val="•"/>
+      <w:lvlJc w:val="left"/>
+      <w:pPr>
+        <w:tabs>
+          <w:tab w:val="num" w:pos="6480"/>
+        </w:tabs>
+        <w:ind w:left="6480" w:hanging="360"/>
+      </w:pPr>
+      <w:rPr>
+        <w:rFonts w:ascii="Arial" w:hAnsi="Arial" w:hint="default"/>
+      </w:rPr>
+    </w:lvl>
+  </w:abstractNum>
+  <w:abstractNum w:abstractNumId="14" w15:restartNumberingAfterBreak="0">
     <w:nsid w:val="745A0452"/>
     <w:multiLevelType w:val="multilevel"/>
     <w:tmpl w:val="E140F350"/>
@@ -7647,7 +8861,7 @@
       </w:rPr>
     </w:lvl>
   </w:abstractNum>
-  <w:abstractNum w:abstractNumId="10" w15:restartNumberingAfterBreak="0">
+  <w:abstractNum w:abstractNumId="15" w15:restartNumberingAfterBreak="0">
     <w:nsid w:val="75286160"/>
     <w:multiLevelType w:val="hybridMultilevel"/>
     <w:tmpl w:val="E84C3438"/>
@@ -7760,7 +8974,7 @@
       </w:rPr>
     </w:lvl>
   </w:abstractNum>
-  <w:abstractNum w:abstractNumId="11" w15:restartNumberingAfterBreak="0">
+  <w:abstractNum w:abstractNumId="16" w15:restartNumberingAfterBreak="0">
     <w:nsid w:val="755504D4"/>
     <w:multiLevelType w:val="hybridMultilevel"/>
     <w:tmpl w:val="CBEC91F2"/>
@@ -7873,7 +9087,7 @@
       </w:rPr>
     </w:lvl>
   </w:abstractNum>
-  <w:abstractNum w:abstractNumId="12" w15:restartNumberingAfterBreak="0">
+  <w:abstractNum w:abstractNumId="17" w15:restartNumberingAfterBreak="0">
     <w:nsid w:val="7694676C"/>
     <w:multiLevelType w:val="multilevel"/>
     <w:tmpl w:val="CAB05ED0"/>
@@ -8022,7 +9236,7 @@
       </w:rPr>
     </w:lvl>
   </w:abstractNum>
-  <w:abstractNum w:abstractNumId="13" w15:restartNumberingAfterBreak="0">
+  <w:abstractNum w:abstractNumId="18" w15:restartNumberingAfterBreak="0">
     <w:nsid w:val="7B4D1282"/>
     <w:multiLevelType w:val="hybridMultilevel"/>
     <w:tmpl w:val="6B90FFAE"/>
@@ -8136,46 +9350,61 @@
     </w:lvl>
   </w:abstractNum>
   <w:num w:numId="1">
-    <w:abstractNumId w:val="3"/>
+    <w:abstractNumId w:val="5"/>
   </w:num>
   <w:num w:numId="2">
-    <w:abstractNumId w:val="4"/>
+    <w:abstractNumId w:val="6"/>
   </w:num>
   <w:num w:numId="3">
-    <w:abstractNumId w:val="5"/>
+    <w:abstractNumId w:val="7"/>
   </w:num>
   <w:num w:numId="4">
     <w:abstractNumId w:val="0"/>
   </w:num>
   <w:num w:numId="5">
-    <w:abstractNumId w:val="7"/>
+    <w:abstractNumId w:val="10"/>
   </w:num>
   <w:num w:numId="6">
     <w:abstractNumId w:val="1"/>
   </w:num>
   <w:num w:numId="7">
-    <w:abstractNumId w:val="12"/>
+    <w:abstractNumId w:val="17"/>
   </w:num>
   <w:num w:numId="8">
     <w:abstractNumId w:val="2"/>
   </w:num>
   <w:num w:numId="9">
+    <w:abstractNumId w:val="12"/>
+  </w:num>
+  <w:num w:numId="10">
+    <w:abstractNumId w:val="16"/>
+  </w:num>
+  <w:num w:numId="11">
+    <w:abstractNumId w:val="15"/>
+  </w:num>
+  <w:num w:numId="12">
+    <w:abstractNumId w:val="9"/>
+  </w:num>
+  <w:num w:numId="13">
+    <w:abstractNumId w:val="18"/>
+  </w:num>
+  <w:num w:numId="14">
+    <w:abstractNumId w:val="14"/>
+  </w:num>
+  <w:num w:numId="15">
+    <w:abstractNumId w:val="13"/>
+  </w:num>
+  <w:num w:numId="16">
+    <w:abstractNumId w:val="11"/>
+  </w:num>
+  <w:num w:numId="17">
+    <w:abstractNumId w:val="3"/>
+  </w:num>
+  <w:num w:numId="18">
     <w:abstractNumId w:val="8"/>
   </w:num>
-  <w:num w:numId="10">
-    <w:abstractNumId w:val="11"/>
-  </w:num>
-  <w:num w:numId="11">
-    <w:abstractNumId w:val="10"/>
-  </w:num>
-  <w:num w:numId="12">
-    <w:abstractNumId w:val="6"/>
-  </w:num>
-  <w:num w:numId="13">
-    <w:abstractNumId w:val="13"/>
-  </w:num>
-  <w:num w:numId="14">
-    <w:abstractNumId w:val="9"/>
+  <w:num w:numId="19">
+    <w:abstractNumId w:val="4"/>
   </w:num>
   <w:numIdMacAtCleanup w:val="14"/>
 </w:numbering>
@@ -11072,7 +12301,7 @@
 </file>
 
 <file path=customXml/itemProps1.xml><?xml version="1.0" encoding="utf-8"?>
-<ds:datastoreItem xmlns:ds="http://schemas.openxmlformats.org/officeDocument/2006/customXml" ds:itemID="{D008D692-4E05-4E2A-A1EE-8CFDE5053910}">
+<ds:datastoreItem xmlns:ds="http://schemas.openxmlformats.org/officeDocument/2006/customXml" ds:itemID="{EDB093B5-4629-4D26-A25E-F3104FA8E201}">
   <ds:schemaRefs>
     <ds:schemaRef ds:uri="http://schemas.openxmlformats.org/officeDocument/2006/bibliography"/>
   </ds:schemaRefs>

</xml_diff>